<commit_message>
docs: actualizar informe y evidencias de MySQL y persistencia
</commit_message>
<xml_diff>
--- a/docs/Informe-Laboratorio07.docx
+++ b/docs/Informe-Laboratorio07.docx
@@ -71,7 +71,7 @@
         <w:pStyle w:val="Normal"/>
       </w:pPr>
       <w:r>
-        <w:t xml:space="preserve">1. Se creó un proyecto Maven con Java 17 como versión objetivo, Spring Boot 3.5.6, Spring Web, Spring Security, Spring Data JPA y el controlador de MySQL. H2 se usa exclusivamente en el perfil opcional de demostración y en las pruebas locales.</w:t>
+        <w:t xml:space="preserve">1. Se creó un proyecto Maven con Java 17 como versión objetivo, Spring Boot 3.5.6, Spring Web, Spring Security, Spring Data JPA y el controlador de MySQL. Se verificó con MySQL Community 8.4.11 y se conservó H2 como perfil opcional de demostración y alternativa de pruebas.</w:t>
       </w:r>
     </w:p>
     <w:p>
@@ -504,15 +504,15 @@
         <w:pStyle w:val="Normal"/>
       </w:pPr>
       <w:r>
-        <w:t xml:space="preserve">Las pruebas locales del backend y del navegador confirmaron la matriz anterior usando H2. Se ejecutaron 32 pruebas de backend y 6 pruebas de navegador sin fallos. Los resultados de la colección Postman ejecutada con Newman se registran en docs/Verificacion.md. No se atribuyen estos resultados a una ejecución gráfica en Postman.</w:t>
-      </w:r>
-    </w:p>
-    <w:p>
-      <w:pPr>
-        <w:pStyle w:val="Normal"/>
-      </w:pPr>
-      <w:r>
-        <w:t xml:space="preserve">MySQL se configura mediante application.properties y el script sql/01-create-database.sql. Como no había un servidor MySQL activo ni Docker disponible en el equipo, la conexión real a MySQL y el arranque con Docker quedan pendientes de comprobar en ese entorno. El perfil H2 permite ejecutar toda la aplicación inmediatamente para la demostración.</w:t>
+        <w:t xml:space="preserve">Las pruebas confirmaron la matriz anterior con MySQL real. Se ejecutaron 32 pruebas de backend y 6 pruebas de navegador sin fallos, además de 27 solicitudes y 42 aserciones de la colección Postman mediante Newman. Los resultados están en docs/Verificacion.md. No se atribuyen estos resultados a una ejecución gráfica en Postman.</w:t>
+      </w:r>
+    </w:p>
+    <w:p>
+      <w:pPr>
+        <w:pStyle w:val="Normal"/>
+      </w:pPr>
+      <w:r>
+        <w:t xml:space="preserve">MySQL se configura mediante application.properties y el script sql/01-create-database.sql. Se preparó MySQL portable dentro del proyecto, escuchando en 127.0.0.1:3307, con la base securitydb, un usuario de aplicación y claves locales aleatorias excluidas de Git. scripts/start-lab.cmd arranca MySQL y la aplicación. Las pruebas del backend usan securitydb_test para separar los datos de prueba. Se reiniciaron ambos procesos y se confirmó que las tres cuentas y los tres roles persistieron. Docker se ofrece solo como alternativa opcional y no se ejecutó en este equipo.</w:t>
       </w:r>
     </w:p>
     <w:p>
@@ -560,7 +560,7 @@
         <w:pStyle w:val="Normal"/>
       </w:pPr>
       <w:r>
-        <w:t xml:space="preserve">5. La ausencia de MySQL activo impidió comprobar localmente ese motor. Se separó un perfil H2 para probar autenticación y permisos, y se documentó esta limitación junto con el procedimiento de MySQL.</w:t>
+        <w:t xml:space="preserve">5. Como el equipo no tenía MySQL activo, se preparó una distribución portable oficial. Se utilizó un puerto propio y un usuario limitado a las bases del laboratorio; los usuarios y roles se conservaron al reiniciar el servidor.</w:t>
       </w:r>
     </w:p>
     <w:p>
@@ -608,7 +608,7 @@
         <w:pStyle w:val="Normal"/>
       </w:pPr>
       <w:r>
-        <w:t xml:space="preserve">5. La separación entre código, configuración, pruebas y documentación facilita reproducir el laboratorio. Para completar la validación específica del motor solicitado se debe ejecutar el mismo proyecto y la colección con MySQL; para un despliegue real también se requiere revisar HTTPS y credenciales de demostración.</w:t>
+        <w:t xml:space="preserve">5. La separación entre código, configuración, pruebas y documentación facilita reproducir el laboratorio. La ejecución con MySQL y las pruebas de persistencia completaron la validación del motor solicitado. Para un despliegue real también se requiere revisar HTTPS y credenciales de demostración.</w:t>
       </w:r>
     </w:p>
     <w:sectPr>

</xml_diff>